<commit_message>
Listić: veći font, bez primera, dodate kratke definicije
Co-Authored-By: Claude Sonnet 5.5 <noreply@anthropic.com>
Claude-Session: https://claude.ai/code/session_0142zm3GLCQ4wkPtTcnim2aU
</commit_message>
<xml_diff>
--- a/ZIS_Formule_Saka.docx
+++ b/ZIS_Formule_Saka.docx
@@ -5,7 +5,7 @@
     <w:p>
       <w:pPr>
         <w:shd w:fill="000000" w:color="auto" w:val="clear"/>
-        <w:spacing w:after="10" w:before="30" w:line="110" w:lineRule="exact"/>
+        <w:spacing w:after="10" w:before="30" w:line="120" w:lineRule="exact"/>
         <w:jc w:val="left"/>
       </w:pPr>
       <w:r>
@@ -14,24 +14,24 @@
           <w:b/>
           <w:bCs/>
           <w:color w:val="FFFFFF"/>
-          <w:sz w:val="10"/>
-          <w:szCs w:val="10"/>
+          <w:sz w:val="11"/>
+          <w:szCs w:val="11"/>
         </w:rPr>
         <w:t xml:space="preserve"> CEZAR / MOD</w:t>
       </w:r>
     </w:p>
     <w:p>
       <w:pPr>
-        <w:spacing w:after="10" w:before="0" w:line="110" w:lineRule="exact"/>
-        <w:jc w:val="left"/>
-      </w:pPr>
-      <w:r>
-        <w:rPr>
-          <w:rFonts w:ascii="Arial Narrow" w:cs="Arial Narrow" w:eastAsia="Arial Narrow" w:hAnsi="Arial Narrow"/>
-          <w:b w:val="false"/>
-          <w:bCs w:val="false"/>
-          <w:sz w:val="10"/>
-          <w:szCs w:val="10"/>
+        <w:spacing w:after="10" w:before="0" w:line="120" w:lineRule="exact"/>
+        <w:jc w:val="left"/>
+      </w:pPr>
+      <w:r>
+        <w:rPr>
+          <w:rFonts w:ascii="Arial Narrow" w:cs="Arial Narrow" w:eastAsia="Arial Narrow" w:hAnsi="Arial Narrow"/>
+          <w:b w:val="false"/>
+          <w:bCs w:val="false"/>
+          <w:sz w:val="11"/>
+          <w:szCs w:val="11"/>
         </w:rPr>
         <w:t xml:space="preserve">A=0…Z=25 · </w:t>
       </w:r>
@@ -40,8 +40,8 @@
           <w:rFonts w:ascii="Arial Narrow" w:cs="Arial Narrow" w:eastAsia="Arial Narrow" w:hAnsi="Arial Narrow"/>
           <w:b/>
           <w:bCs/>
-          <w:sz w:val="10"/>
-          <w:szCs w:val="10"/>
+          <w:sz w:val="11"/>
+          <w:szCs w:val="11"/>
         </w:rPr>
         <w:t xml:space="preserve">Cᵢ=(Pᵢ+K) mod 26</w:t>
       </w:r>
@@ -50,8 +50,8 @@
           <w:rFonts w:ascii="Arial Narrow" w:cs="Arial Narrow" w:eastAsia="Arial Narrow" w:hAnsi="Arial Narrow"/>
           <w:b w:val="false"/>
           <w:bCs w:val="false"/>
-          <w:sz w:val="10"/>
-          <w:szCs w:val="10"/>
+          <w:sz w:val="11"/>
+          <w:szCs w:val="11"/>
         </w:rPr>
         <w:t xml:space="preserve"> · </w:t>
       </w:r>
@@ -60,8 +60,8 @@
           <w:rFonts w:ascii="Arial Narrow" w:cs="Arial Narrow" w:eastAsia="Arial Narrow" w:hAnsi="Arial Narrow"/>
           <w:b/>
           <w:bCs/>
-          <w:sz w:val="10"/>
-          <w:szCs w:val="10"/>
+          <w:sz w:val="11"/>
+          <w:szCs w:val="11"/>
         </w:rPr>
         <w:t xml:space="preserve">Pᵢ=(Cᵢ+26−K) mod 26</w:t>
       </w:r>
@@ -70,32 +70,52 @@
           <w:rFonts w:ascii="Arial Narrow" w:cs="Arial Narrow" w:eastAsia="Arial Narrow" w:hAnsi="Arial Narrow"/>
           <w:b w:val="false"/>
           <w:bCs w:val="false"/>
-          <w:sz w:val="10"/>
-          <w:szCs w:val="10"/>
-        </w:rPr>
-        <w:t xml:space="preserve"> · ključeva 26, prosek 13</w:t>
-      </w:r>
-    </w:p>
-    <w:p>
-      <w:pPr>
-        <w:spacing w:after="10" w:before="0" w:line="110" w:lineRule="exact"/>
-        <w:jc w:val="left"/>
-      </w:pPr>
-      <w:r>
-        <w:rPr>
-          <w:rFonts w:ascii="Arial Narrow" w:cs="Arial Narrow" w:eastAsia="Arial Narrow" w:hAnsi="Arial Narrow"/>
-          <w:b w:val="false"/>
-          <w:bCs w:val="false"/>
-          <w:sz w:val="10"/>
-          <w:szCs w:val="10"/>
-        </w:rPr>
-        <w:t xml:space="preserve">Z,K=4: (25+4) mod 26=3=D · A,K=4: (0+26−4) mod 26=22=W · 316 mod 26=4</w:t>
+          <w:sz w:val="11"/>
+          <w:szCs w:val="11"/>
+        </w:rPr>
+        <w:t xml:space="preserve"> · ključeva 26, prosek 13 · mod=ostatak pri deljenju, (−K) mod 26=26−K</w:t>
+      </w:r>
+    </w:p>
+    <w:p>
+      <w:pPr>
+        <w:spacing w:after="10" w:before="0" w:line="120" w:lineRule="exact"/>
+        <w:jc w:val="left"/>
+      </w:pPr>
+      <w:r>
+        <w:rPr>
+          <w:rFonts w:ascii="Arial Narrow" w:cs="Arial Narrow" w:eastAsia="Arial Narrow" w:hAnsi="Arial Narrow"/>
+          <w:b w:val="false"/>
+          <w:bCs w:val="false"/>
+          <w:sz w:val="11"/>
+          <w:szCs w:val="11"/>
+        </w:rPr>
+        <w:t xml:space="preserve"/>
+      </w:r>
+      <w:r>
+        <w:rPr>
+          <w:rFonts w:ascii="Arial Narrow" w:cs="Arial Narrow" w:eastAsia="Arial Narrow" w:hAnsi="Arial Narrow"/>
+          <w:b/>
+          <w:bCs/>
+          <w:sz w:val="11"/>
+          <w:szCs w:val="11"/>
+        </w:rPr>
+        <w:t xml:space="preserve">Cezar</w:t>
+      </w:r>
+      <w:r>
+        <w:rPr>
+          <w:rFonts w:ascii="Arial Narrow" w:cs="Arial Narrow" w:eastAsia="Arial Narrow" w:hAnsi="Arial Narrow"/>
+          <w:b w:val="false"/>
+          <w:bCs w:val="false"/>
+          <w:sz w:val="11"/>
+          <w:szCs w:val="11"/>
+        </w:rPr>
+        <w:t xml:space="preserve">=monoalfabetska zamena, ključ=pomeraj.</w:t>
       </w:r>
     </w:p>
     <w:p>
       <w:pPr>
         <w:shd w:fill="000000" w:color="auto" w:val="clear"/>
-        <w:spacing w:after="10" w:before="30" w:line="110" w:lineRule="exact"/>
+        <w:spacing w:after="10" w:before="30" w:line="120" w:lineRule="exact"/>
         <w:jc w:val="left"/>
       </w:pPr>
       <w:r>
@@ -104,34 +124,34 @@
           <w:b/>
           <w:bCs/>
           <w:color w:val="FFFFFF"/>
-          <w:sz w:val="10"/>
-          <w:szCs w:val="10"/>
+          <w:sz w:val="11"/>
+          <w:szCs w:val="11"/>
         </w:rPr>
         <w:t xml:space="preserve"> VIŽNER</w:t>
       </w:r>
     </w:p>
     <w:p>
       <w:pPr>
-        <w:spacing w:after="10" w:before="0" w:line="110" w:lineRule="exact"/>
-        <w:jc w:val="left"/>
-      </w:pPr>
-      <w:r>
-        <w:rPr>
-          <w:rFonts w:ascii="Arial Narrow" w:cs="Arial Narrow" w:eastAsia="Arial Narrow" w:hAnsi="Arial Narrow"/>
-          <w:b w:val="false"/>
-          <w:bCs w:val="false"/>
-          <w:sz w:val="10"/>
-          <w:szCs w:val="10"/>
-        </w:rPr>
-        <w:t xml:space="preserve"/>
-      </w:r>
-      <w:r>
-        <w:rPr>
-          <w:rFonts w:ascii="Arial Narrow" w:cs="Arial Narrow" w:eastAsia="Arial Narrow" w:hAnsi="Arial Narrow"/>
-          <w:b/>
-          <w:bCs/>
-          <w:sz w:val="10"/>
-          <w:szCs w:val="10"/>
+        <w:spacing w:after="10" w:before="0" w:line="120" w:lineRule="exact"/>
+        <w:jc w:val="left"/>
+      </w:pPr>
+      <w:r>
+        <w:rPr>
+          <w:rFonts w:ascii="Arial Narrow" w:cs="Arial Narrow" w:eastAsia="Arial Narrow" w:hAnsi="Arial Narrow"/>
+          <w:b w:val="false"/>
+          <w:bCs w:val="false"/>
+          <w:sz w:val="11"/>
+          <w:szCs w:val="11"/>
+        </w:rPr>
+        <w:t xml:space="preserve"/>
+      </w:r>
+      <w:r>
+        <w:rPr>
+          <w:rFonts w:ascii="Arial Narrow" w:cs="Arial Narrow" w:eastAsia="Arial Narrow" w:hAnsi="Arial Narrow"/>
+          <w:b/>
+          <w:bCs/>
+          <w:sz w:val="11"/>
+          <w:szCs w:val="11"/>
         </w:rPr>
         <w:t xml:space="preserve">Cᵢ=(Pᵢ+K(i mod m)) mod 26</w:t>
       </w:r>
@@ -140,16 +160,52 @@
           <w:rFonts w:ascii="Arial Narrow" w:cs="Arial Narrow" w:eastAsia="Arial Narrow" w:hAnsi="Arial Narrow"/>
           <w:b w:val="false"/>
           <w:bCs w:val="false"/>
-          <w:sz w:val="10"/>
-          <w:szCs w:val="10"/>
+          <w:sz w:val="11"/>
+          <w:szCs w:val="11"/>
         </w:rPr>
         <w:t xml:space="preserve"> · m=dužina ključa</w:t>
       </w:r>
     </w:p>
     <w:p>
       <w:pPr>
+        <w:spacing w:after="10" w:before="0" w:line="120" w:lineRule="exact"/>
+        <w:jc w:val="left"/>
+      </w:pPr>
+      <w:r>
+        <w:rPr>
+          <w:rFonts w:ascii="Arial Narrow" w:cs="Arial Narrow" w:eastAsia="Arial Narrow" w:hAnsi="Arial Narrow"/>
+          <w:b w:val="false"/>
+          <w:bCs w:val="false"/>
+          <w:sz w:val="11"/>
+          <w:szCs w:val="11"/>
+        </w:rPr>
+        <w:t xml:space="preserve"/>
+      </w:r>
+      <w:r>
+        <w:rPr>
+          <w:rFonts w:ascii="Arial Narrow" w:cs="Arial Narrow" w:eastAsia="Arial Narrow" w:hAnsi="Arial Narrow"/>
+          <w:b/>
+          <w:bCs/>
+          <w:sz w:val="11"/>
+          <w:szCs w:val="11"/>
+        </w:rPr>
+        <w:t xml:space="preserve">Vižner</w:t>
+      </w:r>
+      <w:r>
+        <w:rPr>
+          <w:rFonts w:ascii="Arial Narrow" w:cs="Arial Narrow" w:eastAsia="Arial Narrow" w:hAnsi="Arial Narrow"/>
+          <w:b w:val="false"/>
+          <w:bCs w:val="false"/>
+          <w:sz w:val="11"/>
+          <w:szCs w:val="11"/>
+        </w:rPr>
+        <w:t xml:space="preserve">=polialfabetska, višestruki Cezar; ključna reč se ponavlja. Napad: IC→dužina ključa→grupe→Cezar.</w:t>
+      </w:r>
+    </w:p>
+    <w:p>
+      <w:pPr>
         <w:shd w:fill="000000" w:color="auto" w:val="clear"/>
-        <w:spacing w:after="10" w:before="30" w:line="110" w:lineRule="exact"/>
+        <w:spacing w:after="10" w:before="30" w:line="120" w:lineRule="exact"/>
         <w:jc w:val="left"/>
       </w:pPr>
       <w:r>
@@ -158,34 +214,34 @@
           <w:b/>
           <w:bCs/>
           <w:color w:val="FFFFFF"/>
-          <w:sz w:val="10"/>
-          <w:szCs w:val="10"/>
+          <w:sz w:val="11"/>
+          <w:szCs w:val="11"/>
         </w:rPr>
         <w:t xml:space="preserve"> HIL</w:t>
       </w:r>
     </w:p>
     <w:p>
       <w:pPr>
-        <w:spacing w:after="10" w:before="0" w:line="110" w:lineRule="exact"/>
-        <w:jc w:val="left"/>
-      </w:pPr>
-      <w:r>
-        <w:rPr>
-          <w:rFonts w:ascii="Arial Narrow" w:cs="Arial Narrow" w:eastAsia="Arial Narrow" w:hAnsi="Arial Narrow"/>
-          <w:b w:val="false"/>
-          <w:bCs w:val="false"/>
-          <w:sz w:val="10"/>
-          <w:szCs w:val="10"/>
-        </w:rPr>
-        <w:t xml:space="preserve"/>
-      </w:r>
-      <w:r>
-        <w:rPr>
-          <w:rFonts w:ascii="Arial Narrow" w:cs="Arial Narrow" w:eastAsia="Arial Narrow" w:hAnsi="Arial Narrow"/>
-          <w:b/>
-          <w:bCs/>
-          <w:sz w:val="10"/>
-          <w:szCs w:val="10"/>
+        <w:spacing w:after="10" w:before="0" w:line="120" w:lineRule="exact"/>
+        <w:jc w:val="left"/>
+      </w:pPr>
+      <w:r>
+        <w:rPr>
+          <w:rFonts w:ascii="Arial Narrow" w:cs="Arial Narrow" w:eastAsia="Arial Narrow" w:hAnsi="Arial Narrow"/>
+          <w:b w:val="false"/>
+          <w:bCs w:val="false"/>
+          <w:sz w:val="11"/>
+          <w:szCs w:val="11"/>
+        </w:rPr>
+        <w:t xml:space="preserve"/>
+      </w:r>
+      <w:r>
+        <w:rPr>
+          <w:rFonts w:ascii="Arial Narrow" w:cs="Arial Narrow" w:eastAsia="Arial Narrow" w:hAnsi="Arial Narrow"/>
+          <w:b/>
+          <w:bCs/>
+          <w:sz w:val="11"/>
+          <w:szCs w:val="11"/>
         </w:rPr>
         <w:t xml:space="preserve">Cᵢ=A·Pᵢ mod 26</w:t>
       </w:r>
@@ -194,8 +250,8 @@
           <w:rFonts w:ascii="Arial Narrow" w:cs="Arial Narrow" w:eastAsia="Arial Narrow" w:hAnsi="Arial Narrow"/>
           <w:b w:val="false"/>
           <w:bCs w:val="false"/>
-          <w:sz w:val="10"/>
-          <w:szCs w:val="10"/>
+          <w:sz w:val="11"/>
+          <w:szCs w:val="11"/>
         </w:rPr>
         <w:t xml:space="preserve"> · </w:t>
       </w:r>
@@ -204,8 +260,8 @@
           <w:rFonts w:ascii="Arial Narrow" w:cs="Arial Narrow" w:eastAsia="Arial Narrow" w:hAnsi="Arial Narrow"/>
           <w:b/>
           <w:bCs/>
-          <w:sz w:val="10"/>
-          <w:szCs w:val="10"/>
+          <w:sz w:val="11"/>
+          <w:szCs w:val="11"/>
         </w:rPr>
         <w:t xml:space="preserve">Pᵢ=A⁻¹·Cᵢ mod 26</w:t>
       </w:r>
@@ -214,8 +270,8 @@
           <w:rFonts w:ascii="Arial Narrow" w:cs="Arial Narrow" w:eastAsia="Arial Narrow" w:hAnsi="Arial Narrow"/>
           <w:b w:val="false"/>
           <w:bCs w:val="false"/>
-          <w:sz w:val="10"/>
-          <w:szCs w:val="10"/>
+          <w:sz w:val="11"/>
+          <w:szCs w:val="11"/>
         </w:rPr>
         <w:t xml:space="preserve"> · ključeva </w:t>
       </w:r>
@@ -224,8 +280,8 @@
           <w:rFonts w:ascii="Arial Narrow" w:cs="Arial Narrow" w:eastAsia="Arial Narrow" w:hAnsi="Arial Narrow"/>
           <w:b/>
           <w:bCs/>
-          <w:sz w:val="10"/>
-          <w:szCs w:val="10"/>
+          <w:sz w:val="11"/>
+          <w:szCs w:val="11"/>
         </w:rPr>
         <w:t xml:space="preserve">26^(n²)</w:t>
       </w:r>
@@ -234,48 +290,68 @@
           <w:rFonts w:ascii="Arial Narrow" w:cs="Arial Narrow" w:eastAsia="Arial Narrow" w:hAnsi="Arial Narrow"/>
           <w:b w:val="false"/>
           <w:bCs w:val="false"/>
-          <w:sz w:val="10"/>
-          <w:szCs w:val="10"/>
-        </w:rPr>
-        <w:t xml:space="preserve"> (n=2: 26⁴=456 976)</w:t>
-      </w:r>
-    </w:p>
-    <w:p>
-      <w:pPr>
-        <w:spacing w:after="10" w:before="0" w:line="110" w:lineRule="exact"/>
-        <w:jc w:val="left"/>
-      </w:pPr>
-      <w:r>
-        <w:rPr>
-          <w:rFonts w:ascii="Arial Narrow" w:cs="Arial Narrow" w:eastAsia="Arial Narrow" w:hAnsi="Arial Narrow"/>
-          <w:b w:val="false"/>
-          <w:bCs w:val="false"/>
-          <w:sz w:val="10"/>
-          <w:szCs w:val="10"/>
+          <w:sz w:val="11"/>
+          <w:szCs w:val="11"/>
+        </w:rPr>
+        <w:t xml:space="preserve"/>
+      </w:r>
+    </w:p>
+    <w:p>
+      <w:pPr>
+        <w:spacing w:after="10" w:before="0" w:line="120" w:lineRule="exact"/>
+        <w:jc w:val="left"/>
+      </w:pPr>
+      <w:r>
+        <w:rPr>
+          <w:rFonts w:ascii="Arial Narrow" w:cs="Arial Narrow" w:eastAsia="Arial Narrow" w:hAnsi="Arial Narrow"/>
+          <w:b w:val="false"/>
+          <w:bCs w:val="false"/>
+          <w:sz w:val="11"/>
+          <w:szCs w:val="11"/>
         </w:rPr>
         <w:t xml:space="preserve">A=[[a,b],[c,d]]: det=ad−bc · A⁻¹=det⁻¹·[[d,−b],[−c,a]] mod 26 · det uzajamno prost sa 26</w:t>
       </w:r>
     </w:p>
     <w:p>
       <w:pPr>
-        <w:spacing w:after="10" w:before="0" w:line="110" w:lineRule="exact"/>
-        <w:jc w:val="left"/>
-      </w:pPr>
-      <w:r>
-        <w:rPr>
-          <w:rFonts w:ascii="Arial Narrow" w:cs="Arial Narrow" w:eastAsia="Arial Narrow" w:hAnsi="Arial Narrow"/>
-          <w:b w:val="false"/>
-          <w:bCs w:val="false"/>
-          <w:sz w:val="10"/>
-          <w:szCs w:val="10"/>
-        </w:rPr>
-        <w:t xml:space="preserve">A=[[22,13],[11,5]]: det=−33≡19, 19⁻¹=11, A⁻¹=[[3,13],[9,8]] · C₀: 22·12+13·4=316→4=E; 11·12+5·4=152→22=W</w:t>
+        <w:spacing w:after="10" w:before="0" w:line="120" w:lineRule="exact"/>
+        <w:jc w:val="left"/>
+      </w:pPr>
+      <w:r>
+        <w:rPr>
+          <w:rFonts w:ascii="Arial Narrow" w:cs="Arial Narrow" w:eastAsia="Arial Narrow" w:hAnsi="Arial Narrow"/>
+          <w:b w:val="false"/>
+          <w:bCs w:val="false"/>
+          <w:sz w:val="11"/>
+          <w:szCs w:val="11"/>
+        </w:rPr>
+        <w:t xml:space="preserve"/>
+      </w:r>
+      <w:r>
+        <w:rPr>
+          <w:rFonts w:ascii="Arial Narrow" w:cs="Arial Narrow" w:eastAsia="Arial Narrow" w:hAnsi="Arial Narrow"/>
+          <w:b/>
+          <w:bCs/>
+          <w:sz w:val="11"/>
+          <w:szCs w:val="11"/>
+        </w:rPr>
+        <w:t xml:space="preserve">Hil</w:t>
+      </w:r>
+      <w:r>
+        <w:rPr>
+          <w:rFonts w:ascii="Arial Narrow" w:cs="Arial Narrow" w:eastAsia="Arial Narrow" w:hAnsi="Arial Narrow"/>
+          <w:b w:val="false"/>
+          <w:bCs w:val="false"/>
+          <w:sz w:val="11"/>
+          <w:szCs w:val="11"/>
+        </w:rPr>
+        <w:t xml:space="preserve">=poligramska, blok od n slova, ključ=matrica A n×n. Linearna → slaba (poznat OT).</w:t>
       </w:r>
     </w:p>
     <w:p>
       <w:pPr>
         <w:shd w:fill="000000" w:color="auto" w:val="clear"/>
-        <w:spacing w:after="10" w:before="30" w:line="110" w:lineRule="exact"/>
+        <w:spacing w:after="10" w:before="30" w:line="120" w:lineRule="exact"/>
         <w:jc w:val="left"/>
       </w:pPr>
       <w:r>
@@ -284,34 +360,34 @@
           <w:b/>
           <w:bCs/>
           <w:color w:val="FFFFFF"/>
-          <w:sz w:val="10"/>
-          <w:szCs w:val="10"/>
+          <w:sz w:val="11"/>
+          <w:szCs w:val="11"/>
         </w:rPr>
         <w:t xml:space="preserve"> OTP</w:t>
       </w:r>
     </w:p>
     <w:p>
       <w:pPr>
-        <w:spacing w:after="10" w:before="0" w:line="110" w:lineRule="exact"/>
-        <w:jc w:val="left"/>
-      </w:pPr>
-      <w:r>
-        <w:rPr>
-          <w:rFonts w:ascii="Arial Narrow" w:cs="Arial Narrow" w:eastAsia="Arial Narrow" w:hAnsi="Arial Narrow"/>
-          <w:b w:val="false"/>
-          <w:bCs w:val="false"/>
-          <w:sz w:val="10"/>
-          <w:szCs w:val="10"/>
-        </w:rPr>
-        <w:t xml:space="preserve"/>
-      </w:r>
-      <w:r>
-        <w:rPr>
-          <w:rFonts w:ascii="Arial Narrow" w:cs="Arial Narrow" w:eastAsia="Arial Narrow" w:hAnsi="Arial Narrow"/>
-          <w:b/>
-          <w:bCs/>
-          <w:sz w:val="10"/>
-          <w:szCs w:val="10"/>
+        <w:spacing w:after="10" w:before="0" w:line="120" w:lineRule="exact"/>
+        <w:jc w:val="left"/>
+      </w:pPr>
+      <w:r>
+        <w:rPr>
+          <w:rFonts w:ascii="Arial Narrow" w:cs="Arial Narrow" w:eastAsia="Arial Narrow" w:hAnsi="Arial Narrow"/>
+          <w:b w:val="false"/>
+          <w:bCs w:val="false"/>
+          <w:sz w:val="11"/>
+          <w:szCs w:val="11"/>
+        </w:rPr>
+        <w:t xml:space="preserve"/>
+      </w:r>
+      <w:r>
+        <w:rPr>
+          <w:rFonts w:ascii="Arial Narrow" w:cs="Arial Narrow" w:eastAsia="Arial Narrow" w:hAnsi="Arial Narrow"/>
+          <w:b/>
+          <w:bCs/>
+          <w:sz w:val="11"/>
+          <w:szCs w:val="11"/>
         </w:rPr>
         <w:t xml:space="preserve">Cᵢ=Pᵢ⊕Kᵢ</w:t>
       </w:r>
@@ -320,8 +396,8 @@
           <w:rFonts w:ascii="Arial Narrow" w:cs="Arial Narrow" w:eastAsia="Arial Narrow" w:hAnsi="Arial Narrow"/>
           <w:b w:val="false"/>
           <w:bCs w:val="false"/>
-          <w:sz w:val="10"/>
-          <w:szCs w:val="10"/>
+          <w:sz w:val="11"/>
+          <w:szCs w:val="11"/>
         </w:rPr>
         <w:t xml:space="preserve"> · </w:t>
       </w:r>
@@ -330,8 +406,8 @@
           <w:rFonts w:ascii="Arial Narrow" w:cs="Arial Narrow" w:eastAsia="Arial Narrow" w:hAnsi="Arial Narrow"/>
           <w:b/>
           <w:bCs/>
-          <w:sz w:val="10"/>
-          <w:szCs w:val="10"/>
+          <w:sz w:val="11"/>
+          <w:szCs w:val="11"/>
         </w:rPr>
         <w:t xml:space="preserve">Pᵢ=Cᵢ⊕Kᵢ</w:t>
       </w:r>
@@ -340,32 +416,52 @@
           <w:rFonts w:ascii="Arial Narrow" w:cs="Arial Narrow" w:eastAsia="Arial Narrow" w:hAnsi="Arial Narrow"/>
           <w:b w:val="false"/>
           <w:bCs w:val="false"/>
-          <w:sz w:val="10"/>
-          <w:szCs w:val="10"/>
+          <w:sz w:val="11"/>
+          <w:szCs w:val="11"/>
         </w:rPr>
         <w:t xml:space="preserve"> · 0⊕0=0, 0⊕1=1, 1⊕0=1, 1⊕1=0 · x⊕x=0, x⊕0=x</w:t>
       </w:r>
     </w:p>
     <w:p>
       <w:pPr>
-        <w:spacing w:after="10" w:before="0" w:line="110" w:lineRule="exact"/>
-        <w:jc w:val="left"/>
-      </w:pPr>
-      <w:r>
-        <w:rPr>
-          <w:rFonts w:ascii="Arial Narrow" w:cs="Arial Narrow" w:eastAsia="Arial Narrow" w:hAnsi="Arial Narrow"/>
-          <w:b w:val="false"/>
-          <w:bCs w:val="false"/>
-          <w:sz w:val="10"/>
-          <w:szCs w:val="10"/>
-        </w:rPr>
-        <w:t xml:space="preserve">E000 H001 I010 K011 L100 R101 S110 T111 · ključ ≥ tekst, jednokratan</w:t>
+        <w:spacing w:after="10" w:before="0" w:line="120" w:lineRule="exact"/>
+        <w:jc w:val="left"/>
+      </w:pPr>
+      <w:r>
+        <w:rPr>
+          <w:rFonts w:ascii="Arial Narrow" w:cs="Arial Narrow" w:eastAsia="Arial Narrow" w:hAnsi="Arial Narrow"/>
+          <w:b w:val="false"/>
+          <w:bCs w:val="false"/>
+          <w:sz w:val="11"/>
+          <w:szCs w:val="11"/>
+        </w:rPr>
+        <w:t xml:space="preserve"/>
+      </w:r>
+      <w:r>
+        <w:rPr>
+          <w:rFonts w:ascii="Arial Narrow" w:cs="Arial Narrow" w:eastAsia="Arial Narrow" w:hAnsi="Arial Narrow"/>
+          <w:b/>
+          <w:bCs/>
+          <w:sz w:val="11"/>
+          <w:szCs w:val="11"/>
+        </w:rPr>
+        <w:t xml:space="preserve">OTP</w:t>
+      </w:r>
+      <w:r>
+        <w:rPr>
+          <w:rFonts w:ascii="Arial Narrow" w:cs="Arial Narrow" w:eastAsia="Arial Narrow" w:hAnsi="Arial Narrow"/>
+          <w:b w:val="false"/>
+          <w:bCs w:val="false"/>
+          <w:sz w:val="11"/>
+          <w:szCs w:val="11"/>
+        </w:rPr>
+        <w:t xml:space="preserve">=jedina dokazano sigurna šifra; ključ slučajan, nepredvidiv, balansiran, ≥ tekst, jednokratan.</w:t>
       </w:r>
     </w:p>
     <w:p>
       <w:pPr>
         <w:shd w:fill="000000" w:color="auto" w:val="clear"/>
-        <w:spacing w:after="10" w:before="30" w:line="110" w:lineRule="exact"/>
+        <w:spacing w:after="10" w:before="30" w:line="120" w:lineRule="exact"/>
         <w:jc w:val="left"/>
       </w:pPr>
       <w:r>
@@ -374,34 +470,34 @@
           <w:b/>
           <w:bCs/>
           <w:color w:val="FFFFFF"/>
-          <w:sz w:val="10"/>
-          <w:szCs w:val="10"/>
+          <w:sz w:val="11"/>
+          <w:szCs w:val="11"/>
         </w:rPr>
         <w:t xml:space="preserve"> INDEKS KOINCIDENCIJE</w:t>
       </w:r>
     </w:p>
     <w:p>
       <w:pPr>
-        <w:spacing w:after="10" w:before="0" w:line="110" w:lineRule="exact"/>
-        <w:jc w:val="left"/>
-      </w:pPr>
-      <w:r>
-        <w:rPr>
-          <w:rFonts w:ascii="Arial Narrow" w:cs="Arial Narrow" w:eastAsia="Arial Narrow" w:hAnsi="Arial Narrow"/>
-          <w:b w:val="false"/>
-          <w:bCs w:val="false"/>
-          <w:sz w:val="10"/>
-          <w:szCs w:val="10"/>
-        </w:rPr>
-        <w:t xml:space="preserve"/>
-      </w:r>
-      <w:r>
-        <w:rPr>
-          <w:rFonts w:ascii="Arial Narrow" w:cs="Arial Narrow" w:eastAsia="Arial Narrow" w:hAnsi="Arial Narrow"/>
-          <w:b/>
-          <w:bCs/>
-          <w:sz w:val="10"/>
-          <w:szCs w:val="10"/>
+        <w:spacing w:after="10" w:before="0" w:line="120" w:lineRule="exact"/>
+        <w:jc w:val="left"/>
+      </w:pPr>
+      <w:r>
+        <w:rPr>
+          <w:rFonts w:ascii="Arial Narrow" w:cs="Arial Narrow" w:eastAsia="Arial Narrow" w:hAnsi="Arial Narrow"/>
+          <w:b w:val="false"/>
+          <w:bCs w:val="false"/>
+          <w:sz w:val="11"/>
+          <w:szCs w:val="11"/>
+        </w:rPr>
+        <w:t xml:space="preserve"/>
+      </w:r>
+      <w:r>
+        <w:rPr>
+          <w:rFonts w:ascii="Arial Narrow" w:cs="Arial Narrow" w:eastAsia="Arial Narrow" w:hAnsi="Arial Narrow"/>
+          <w:b/>
+          <w:bCs/>
+          <w:sz w:val="11"/>
+          <w:szCs w:val="11"/>
         </w:rPr>
         <w:t xml:space="preserve">I=Σ(nᵢ/n)·((nᵢ−1)/(n−1))=Σpᵢ²</w:t>
       </w:r>
@@ -410,8 +506,8 @@
           <w:rFonts w:ascii="Arial Narrow" w:cs="Arial Narrow" w:eastAsia="Arial Narrow" w:hAnsi="Arial Narrow"/>
           <w:b w:val="false"/>
           <w:bCs w:val="false"/>
-          <w:sz w:val="10"/>
-          <w:szCs w:val="10"/>
+          <w:sz w:val="11"/>
+          <w:szCs w:val="11"/>
         </w:rPr>
         <w:t xml:space="preserve"> · prosta zamena </w:t>
       </w:r>
@@ -420,8 +516,8 @@
           <w:rFonts w:ascii="Arial Narrow" w:cs="Arial Narrow" w:eastAsia="Arial Narrow" w:hAnsi="Arial Narrow"/>
           <w:b/>
           <w:bCs/>
-          <w:sz w:val="10"/>
-          <w:szCs w:val="10"/>
+          <w:sz w:val="11"/>
+          <w:szCs w:val="11"/>
         </w:rPr>
         <w:t xml:space="preserve">≈0,065</w:t>
       </w:r>
@@ -430,8 +526,8 @@
           <w:rFonts w:ascii="Arial Narrow" w:cs="Arial Narrow" w:eastAsia="Arial Narrow" w:hAnsi="Arial Narrow"/>
           <w:b w:val="false"/>
           <w:bCs w:val="false"/>
-          <w:sz w:val="10"/>
-          <w:szCs w:val="10"/>
+          <w:sz w:val="11"/>
+          <w:szCs w:val="11"/>
         </w:rPr>
         <w:t xml:space="preserve"> · slučajan 26·(1/26)²=</w:t>
       </w:r>
@@ -440,8 +536,8 @@
           <w:rFonts w:ascii="Arial Narrow" w:cs="Arial Narrow" w:eastAsia="Arial Narrow" w:hAnsi="Arial Narrow"/>
           <w:b/>
           <w:bCs/>
-          <w:sz w:val="10"/>
-          <w:szCs w:val="10"/>
+          <w:sz w:val="11"/>
+          <w:szCs w:val="11"/>
         </w:rPr>
         <w:t xml:space="preserve">0,03846</w:t>
       </w:r>
@@ -450,34 +546,34 @@
           <w:rFonts w:ascii="Arial Narrow" w:cs="Arial Narrow" w:eastAsia="Arial Narrow" w:hAnsi="Arial Narrow"/>
           <w:b w:val="false"/>
           <w:bCs w:val="false"/>
-          <w:sz w:val="10"/>
-          <w:szCs w:val="10"/>
-        </w:rPr>
-        <w:t xml:space="preserve"/>
-      </w:r>
-    </w:p>
-    <w:p>
-      <w:pPr>
-        <w:spacing w:after="10" w:before="0" w:line="110" w:lineRule="exact"/>
-        <w:jc w:val="left"/>
-      </w:pPr>
-      <w:r>
-        <w:rPr>
-          <w:rFonts w:ascii="Arial Narrow" w:cs="Arial Narrow" w:eastAsia="Arial Narrow" w:hAnsi="Arial Narrow"/>
-          <w:b w:val="false"/>
-          <w:bCs w:val="false"/>
-          <w:sz w:val="10"/>
-          <w:szCs w:val="10"/>
-        </w:rPr>
-        <w:t xml:space="preserve"/>
-      </w:r>
-      <w:r>
-        <w:rPr>
-          <w:rFonts w:ascii="Arial Narrow" w:cs="Arial Narrow" w:eastAsia="Arial Narrow" w:hAnsi="Arial Narrow"/>
-          <w:b/>
-          <w:bCs/>
-          <w:sz w:val="10"/>
-          <w:szCs w:val="10"/>
+          <w:sz w:val="11"/>
+          <w:szCs w:val="11"/>
+        </w:rPr>
+        <w:t xml:space="preserve"/>
+      </w:r>
+    </w:p>
+    <w:p>
+      <w:pPr>
+        <w:spacing w:after="10" w:before="0" w:line="120" w:lineRule="exact"/>
+        <w:jc w:val="left"/>
+      </w:pPr>
+      <w:r>
+        <w:rPr>
+          <w:rFonts w:ascii="Arial Narrow" w:cs="Arial Narrow" w:eastAsia="Arial Narrow" w:hAnsi="Arial Narrow"/>
+          <w:b w:val="false"/>
+          <w:bCs w:val="false"/>
+          <w:sz w:val="11"/>
+          <w:szCs w:val="11"/>
+        </w:rPr>
+        <w:t xml:space="preserve"/>
+      </w:r>
+      <w:r>
+        <w:rPr>
+          <w:rFonts w:ascii="Arial Narrow" w:cs="Arial Narrow" w:eastAsia="Arial Narrow" w:hAnsi="Arial Narrow"/>
+          <w:b/>
+          <w:bCs/>
+          <w:sz w:val="11"/>
+          <w:szCs w:val="11"/>
         </w:rPr>
         <w:t xml:space="preserve">I≈((n/k−1)/(n−1))·0,065+((n−n/k)/(n−1))·0,03846</w:t>
       </w:r>
@@ -486,34 +582,34 @@
           <w:rFonts w:ascii="Arial Narrow" w:cs="Arial Narrow" w:eastAsia="Arial Narrow" w:hAnsi="Arial Narrow"/>
           <w:b w:val="false"/>
           <w:bCs w:val="false"/>
-          <w:sz w:val="10"/>
-          <w:szCs w:val="10"/>
-        </w:rPr>
-        <w:t xml:space="preserve"/>
-      </w:r>
-    </w:p>
-    <w:p>
-      <w:pPr>
-        <w:spacing w:after="10" w:before="0" w:line="110" w:lineRule="exact"/>
-        <w:jc w:val="left"/>
-      </w:pPr>
-      <w:r>
-        <w:rPr>
-          <w:rFonts w:ascii="Arial Narrow" w:cs="Arial Narrow" w:eastAsia="Arial Narrow" w:hAnsi="Arial Narrow"/>
-          <w:b w:val="false"/>
-          <w:bCs w:val="false"/>
-          <w:sz w:val="10"/>
-          <w:szCs w:val="10"/>
-        </w:rPr>
-        <w:t xml:space="preserve"/>
-      </w:r>
-      <w:r>
-        <w:rPr>
-          <w:rFonts w:ascii="Arial Narrow" w:cs="Arial Narrow" w:eastAsia="Arial Narrow" w:hAnsi="Arial Narrow"/>
-          <w:b/>
-          <w:bCs/>
-          <w:sz w:val="10"/>
-          <w:szCs w:val="10"/>
+          <w:sz w:val="11"/>
+          <w:szCs w:val="11"/>
+        </w:rPr>
+        <w:t xml:space="preserve"/>
+      </w:r>
+    </w:p>
+    <w:p>
+      <w:pPr>
+        <w:spacing w:after="10" w:before="0" w:line="120" w:lineRule="exact"/>
+        <w:jc w:val="left"/>
+      </w:pPr>
+      <w:r>
+        <w:rPr>
+          <w:rFonts w:ascii="Arial Narrow" w:cs="Arial Narrow" w:eastAsia="Arial Narrow" w:hAnsi="Arial Narrow"/>
+          <w:b w:val="false"/>
+          <w:bCs w:val="false"/>
+          <w:sz w:val="11"/>
+          <w:szCs w:val="11"/>
+        </w:rPr>
+        <w:t xml:space="preserve"/>
+      </w:r>
+      <w:r>
+        <w:rPr>
+          <w:rFonts w:ascii="Arial Narrow" w:cs="Arial Narrow" w:eastAsia="Arial Narrow" w:hAnsi="Arial Narrow"/>
+          <w:b/>
+          <w:bCs/>
+          <w:sz w:val="11"/>
+          <w:szCs w:val="11"/>
         </w:rPr>
         <w:t xml:space="preserve">k≈0,027·n/((n−1)·I+0,065−0,0385·n)</w:t>
       </w:r>
@@ -522,16 +618,52 @@
           <w:rFonts w:ascii="Arial Narrow" w:cs="Arial Narrow" w:eastAsia="Arial Narrow" w:hAnsi="Arial Narrow"/>
           <w:b w:val="false"/>
           <w:bCs w:val="false"/>
-          <w:sz w:val="10"/>
-          <w:szCs w:val="10"/>
-        </w:rPr>
-        <w:t xml:space="preserve"/>
+          <w:sz w:val="11"/>
+          <w:szCs w:val="11"/>
+        </w:rPr>
+        <w:t xml:space="preserve"/>
+      </w:r>
+    </w:p>
+    <w:p>
+      <w:pPr>
+        <w:spacing w:after="10" w:before="0" w:line="120" w:lineRule="exact"/>
+        <w:jc w:val="left"/>
+      </w:pPr>
+      <w:r>
+        <w:rPr>
+          <w:rFonts w:ascii="Arial Narrow" w:cs="Arial Narrow" w:eastAsia="Arial Narrow" w:hAnsi="Arial Narrow"/>
+          <w:b w:val="false"/>
+          <w:bCs w:val="false"/>
+          <w:sz w:val="11"/>
+          <w:szCs w:val="11"/>
+        </w:rPr>
+        <w:t xml:space="preserve"/>
+      </w:r>
+      <w:r>
+        <w:rPr>
+          <w:rFonts w:ascii="Arial Narrow" w:cs="Arial Narrow" w:eastAsia="Arial Narrow" w:hAnsi="Arial Narrow"/>
+          <w:b/>
+          <w:bCs/>
+          <w:sz w:val="11"/>
+          <w:szCs w:val="11"/>
+        </w:rPr>
+        <w:t xml:space="preserve">IC</w:t>
+      </w:r>
+      <w:r>
+        <w:rPr>
+          <w:rFonts w:ascii="Arial Narrow" w:cs="Arial Narrow" w:eastAsia="Arial Narrow" w:hAnsi="Arial Narrow"/>
+          <w:b w:val="false"/>
+          <w:bCs w:val="false"/>
+          <w:sz w:val="11"/>
+          <w:szCs w:val="11"/>
+        </w:rPr>
+        <w:t xml:space="preserve">=verovatnoća da su 2 slučajno izabrana slova ista.</w:t>
       </w:r>
     </w:p>
     <w:p>
       <w:pPr>
         <w:shd w:fill="000000" w:color="auto" w:val="clear"/>
-        <w:spacing w:after="10" w:before="30" w:line="110" w:lineRule="exact"/>
+        <w:spacing w:after="10" w:before="30" w:line="120" w:lineRule="exact"/>
         <w:jc w:val="left"/>
       </w:pPr>
       <w:r>
@@ -540,24 +672,24 @@
           <w:b/>
           <w:bCs/>
           <w:color w:val="FFFFFF"/>
-          <w:sz w:val="10"/>
-          <w:szCs w:val="10"/>
+          <w:sz w:val="11"/>
+          <w:szCs w:val="11"/>
         </w:rPr>
         <w:t xml:space="preserve"> BROJ KLJUČEVA / VREME</w:t>
       </w:r>
     </w:p>
     <w:p>
       <w:pPr>
-        <w:spacing w:after="10" w:before="0" w:line="110" w:lineRule="exact"/>
-        <w:jc w:val="left"/>
-      </w:pPr>
-      <w:r>
-        <w:rPr>
-          <w:rFonts w:ascii="Arial Narrow" w:cs="Arial Narrow" w:eastAsia="Arial Narrow" w:hAnsi="Arial Narrow"/>
-          <w:b w:val="false"/>
-          <w:bCs w:val="false"/>
-          <w:sz w:val="10"/>
-          <w:szCs w:val="10"/>
+        <w:spacing w:after="10" w:before="0" w:line="120" w:lineRule="exact"/>
+        <w:jc w:val="left"/>
+      </w:pPr>
+      <w:r>
+        <w:rPr>
+          <w:rFonts w:ascii="Arial Narrow" w:cs="Arial Narrow" w:eastAsia="Arial Narrow" w:hAnsi="Arial Narrow"/>
+          <w:b w:val="false"/>
+          <w:bCs w:val="false"/>
+          <w:sz w:val="11"/>
+          <w:szCs w:val="11"/>
         </w:rPr>
         <w:t xml:space="preserve">dvostruka transp. </w:t>
       </w:r>
@@ -566,8 +698,8 @@
           <w:rFonts w:ascii="Arial Narrow" w:cs="Arial Narrow" w:eastAsia="Arial Narrow" w:hAnsi="Arial Narrow"/>
           <w:b/>
           <w:bCs/>
-          <w:sz w:val="10"/>
-          <w:szCs w:val="10"/>
+          <w:sz w:val="11"/>
+          <w:szCs w:val="11"/>
         </w:rPr>
         <w:t xml:space="preserve">m!×n!</w:t>
       </w:r>
@@ -576,18 +708,18 @@
           <w:rFonts w:ascii="Arial Narrow" w:cs="Arial Narrow" w:eastAsia="Arial Narrow" w:hAnsi="Arial Narrow"/>
           <w:b w:val="false"/>
           <w:bCs w:val="false"/>
-          <w:sz w:val="10"/>
-          <w:szCs w:val="10"/>
-        </w:rPr>
-        <w:t xml:space="preserve"> (5!×3!=720) · prosta zamena </w:t>
-      </w:r>
-      <w:r>
-        <w:rPr>
-          <w:rFonts w:ascii="Arial Narrow" w:cs="Arial Narrow" w:eastAsia="Arial Narrow" w:hAnsi="Arial Narrow"/>
-          <w:b/>
-          <w:bCs/>
-          <w:sz w:val="10"/>
-          <w:szCs w:val="10"/>
+          <w:sz w:val="11"/>
+          <w:szCs w:val="11"/>
+        </w:rPr>
+        <w:t xml:space="preserve"> · prosta zamena </w:t>
+      </w:r>
+      <w:r>
+        <w:rPr>
+          <w:rFonts w:ascii="Arial Narrow" w:cs="Arial Narrow" w:eastAsia="Arial Narrow" w:hAnsi="Arial Narrow"/>
+          <w:b/>
+          <w:bCs/>
+          <w:sz w:val="11"/>
+          <w:szCs w:val="11"/>
         </w:rPr>
         <w:t xml:space="preserve">26!&gt;2⁸⁸</w:t>
       </w:r>
@@ -596,34 +728,74 @@
           <w:rFonts w:ascii="Arial Narrow" w:cs="Arial Narrow" w:eastAsia="Arial Narrow" w:hAnsi="Arial Narrow"/>
           <w:b w:val="false"/>
           <w:bCs w:val="false"/>
-          <w:sz w:val="10"/>
-          <w:szCs w:val="10"/>
-        </w:rPr>
-        <w:t xml:space="preserve"> · 5!·9!&gt;2²⁵ · 3!·15!&gt;2⁴²</w:t>
-      </w:r>
-    </w:p>
-    <w:p>
-      <w:pPr>
-        <w:spacing w:after="10" w:before="0" w:line="110" w:lineRule="exact"/>
-        <w:jc w:val="left"/>
-      </w:pPr>
-      <w:r>
-        <w:rPr>
-          <w:rFonts w:ascii="Arial Narrow" w:cs="Arial Narrow" w:eastAsia="Arial Narrow" w:hAnsi="Arial Narrow"/>
-          <w:b w:val="false"/>
-          <w:bCs w:val="false"/>
-          <w:sz w:val="10"/>
-          <w:szCs w:val="10"/>
-        </w:rPr>
-        <w:t xml:space="preserve"/>
-      </w:r>
-      <w:r>
-        <w:rPr>
-          <w:rFonts w:ascii="Arial Narrow" w:cs="Arial Narrow" w:eastAsia="Arial Narrow" w:hAnsi="Arial Narrow"/>
-          <w:b/>
-          <w:bCs/>
-          <w:sz w:val="10"/>
-          <w:szCs w:val="10"/>
+          <w:sz w:val="11"/>
+          <w:szCs w:val="11"/>
+        </w:rPr>
+        <w:t xml:space="preserve"> · 100 bita: </w:t>
+      </w:r>
+      <w:r>
+        <w:rPr>
+          <w:rFonts w:ascii="Arial Narrow" w:cs="Arial Narrow" w:eastAsia="Arial Narrow" w:hAnsi="Arial Narrow"/>
+          <w:b/>
+          <w:bCs/>
+          <w:sz w:val="11"/>
+          <w:szCs w:val="11"/>
+        </w:rPr>
+        <w:t xml:space="preserve">2¹⁰⁰</w:t>
+      </w:r>
+      <w:r>
+        <w:rPr>
+          <w:rFonts w:ascii="Arial Narrow" w:cs="Arial Narrow" w:eastAsia="Arial Narrow" w:hAnsi="Arial Narrow"/>
+          <w:b w:val="false"/>
+          <w:bCs w:val="false"/>
+          <w:sz w:val="11"/>
+          <w:szCs w:val="11"/>
+        </w:rPr>
+        <w:t xml:space="preserve">, prosek </w:t>
+      </w:r>
+      <w:r>
+        <w:rPr>
+          <w:rFonts w:ascii="Arial Narrow" w:cs="Arial Narrow" w:eastAsia="Arial Narrow" w:hAnsi="Arial Narrow"/>
+          <w:b/>
+          <w:bCs/>
+          <w:sz w:val="11"/>
+          <w:szCs w:val="11"/>
+        </w:rPr>
+        <w:t xml:space="preserve">2⁹⁹</w:t>
+      </w:r>
+      <w:r>
+        <w:rPr>
+          <w:rFonts w:ascii="Arial Narrow" w:cs="Arial Narrow" w:eastAsia="Arial Narrow" w:hAnsi="Arial Narrow"/>
+          <w:b w:val="false"/>
+          <w:bCs w:val="false"/>
+          <w:sz w:val="11"/>
+          <w:szCs w:val="11"/>
+        </w:rPr>
+        <w:t xml:space="preserve"/>
+      </w:r>
+    </w:p>
+    <w:p>
+      <w:pPr>
+        <w:spacing w:after="10" w:before="0" w:line="120" w:lineRule="exact"/>
+        <w:jc w:val="left"/>
+      </w:pPr>
+      <w:r>
+        <w:rPr>
+          <w:rFonts w:ascii="Arial Narrow" w:cs="Arial Narrow" w:eastAsia="Arial Narrow" w:hAnsi="Arial Narrow"/>
+          <w:b w:val="false"/>
+          <w:bCs w:val="false"/>
+          <w:sz w:val="11"/>
+          <w:szCs w:val="11"/>
+        </w:rPr>
+        <w:t xml:space="preserve"/>
+      </w:r>
+      <w:r>
+        <w:rPr>
+          <w:rFonts w:ascii="Arial Narrow" w:cs="Arial Narrow" w:eastAsia="Arial Narrow" w:hAnsi="Arial Narrow"/>
+          <w:b/>
+          <w:bCs/>
+          <w:sz w:val="11"/>
+          <w:szCs w:val="11"/>
         </w:rPr>
         <w:t xml:space="preserve">vreme=broj ključeva/brzina</w:t>
       </w:r>
@@ -632,72 +804,16 @@
           <w:rFonts w:ascii="Arial Narrow" w:cs="Arial Narrow" w:eastAsia="Arial Narrow" w:hAnsi="Arial Narrow"/>
           <w:b w:val="false"/>
           <w:bCs w:val="false"/>
-          <w:sz w:val="10"/>
-          <w:szCs w:val="10"/>
+          <w:sz w:val="11"/>
+          <w:szCs w:val="11"/>
         </w:rPr>
         <w:t xml:space="preserve"> · prosek=pola prostora · 2ᵃ/2ᵇ=2ᵃ⁻ᵇ</w:t>
       </w:r>
     </w:p>
     <w:p>
       <w:pPr>
-        <w:spacing w:after="10" w:before="0" w:line="110" w:lineRule="exact"/>
-        <w:jc w:val="left"/>
-      </w:pPr>
-      <w:r>
-        <w:rPr>
-          <w:rFonts w:ascii="Arial Narrow" w:cs="Arial Narrow" w:eastAsia="Arial Narrow" w:hAnsi="Arial Narrow"/>
-          <w:b w:val="false"/>
-          <w:bCs w:val="false"/>
-          <w:sz w:val="10"/>
-          <w:szCs w:val="10"/>
-        </w:rPr>
-        <w:t xml:space="preserve">100 bita: 2¹⁰⁰, prosek 2⁹⁹ · 2⁹⁹/2³⁰=</w:t>
-      </w:r>
-      <w:r>
-        <w:rPr>
-          <w:rFonts w:ascii="Arial Narrow" w:cs="Arial Narrow" w:eastAsia="Arial Narrow" w:hAnsi="Arial Narrow"/>
-          <w:b/>
-          <w:bCs/>
-          <w:sz w:val="10"/>
-          <w:szCs w:val="10"/>
-        </w:rPr>
-        <w:t xml:space="preserve">2⁶⁹ s≈18,7·10¹² god</w:t>
-      </w:r>
-      <w:r>
-        <w:rPr>
-          <w:rFonts w:ascii="Arial Narrow" w:cs="Arial Narrow" w:eastAsia="Arial Narrow" w:hAnsi="Arial Narrow"/>
-          <w:b w:val="false"/>
-          <w:bCs w:val="false"/>
-          <w:sz w:val="10"/>
-          <w:szCs w:val="10"/>
-        </w:rPr>
-        <w:t xml:space="preserve"> · 2⁶⁰/2³⁰=</w:t>
-      </w:r>
-      <w:r>
-        <w:rPr>
-          <w:rFonts w:ascii="Arial Narrow" w:cs="Arial Narrow" w:eastAsia="Arial Narrow" w:hAnsi="Arial Narrow"/>
-          <w:b/>
-          <w:bCs/>
-          <w:sz w:val="10"/>
-          <w:szCs w:val="10"/>
-        </w:rPr>
-        <w:t xml:space="preserve">2³⁰ s≈34 god</w:t>
-      </w:r>
-      <w:r>
-        <w:rPr>
-          <w:rFonts w:ascii="Arial Narrow" w:cs="Arial Narrow" w:eastAsia="Arial Narrow" w:hAnsi="Arial Narrow"/>
-          <w:b w:val="false"/>
-          <w:bCs w:val="false"/>
-          <w:sz w:val="10"/>
-          <w:szCs w:val="10"/>
-        </w:rPr>
-        <w:t xml:space="preserve"/>
-      </w:r>
-    </w:p>
-    <w:p>
-      <w:pPr>
         <w:shd w:fill="000000" w:color="auto" w:val="clear"/>
-        <w:spacing w:after="10" w:before="30" w:line="110" w:lineRule="exact"/>
+        <w:spacing w:after="10" w:before="30" w:line="120" w:lineRule="exact"/>
         <w:jc w:val="left"/>
       </w:pPr>
       <w:r>
@@ -706,33 +822,433 @@
           <w:b/>
           <w:bCs/>
           <w:color w:val="FFFFFF"/>
-          <w:sz w:val="10"/>
-          <w:szCs w:val="10"/>
-        </w:rPr>
-        <w:t xml:space="preserve"> OSTALO</w:t>
-      </w:r>
-    </w:p>
-    <w:p>
-      <w:pPr>
-        <w:spacing w:after="10" w:before="0" w:line="110" w:lineRule="exact"/>
-        <w:jc w:val="left"/>
-      </w:pPr>
-      <w:r>
-        <w:rPr>
-          <w:rFonts w:ascii="Arial Narrow" w:cs="Arial Narrow" w:eastAsia="Arial Narrow" w:hAnsi="Arial Narrow"/>
-          <w:b w:val="false"/>
-          <w:bCs w:val="false"/>
-          <w:sz w:val="10"/>
-          <w:szCs w:val="10"/>
-        </w:rPr>
-        <w:t xml:space="preserve">homofona 00–31: 32−26=6 slova sa 2 koda (A,E,N,O,R,T) · blok 64 (128) bita</w:t>
+          <w:sz w:val="11"/>
+          <w:szCs w:val="11"/>
+        </w:rPr>
+        <w:t xml:space="preserve"> DEFINICIJE</w:t>
+      </w:r>
+    </w:p>
+    <w:p>
+      <w:pPr>
+        <w:spacing w:after="10" w:before="0" w:line="120" w:lineRule="exact"/>
+        <w:jc w:val="left"/>
+      </w:pPr>
+      <w:r>
+        <w:rPr>
+          <w:rFonts w:ascii="Arial Narrow" w:cs="Arial Narrow" w:eastAsia="Arial Narrow" w:hAnsi="Arial Narrow"/>
+          <w:b w:val="false"/>
+          <w:bCs w:val="false"/>
+          <w:sz w:val="11"/>
+          <w:szCs w:val="11"/>
+        </w:rPr>
+        <w:t xml:space="preserve"/>
+      </w:r>
+      <w:r>
+        <w:rPr>
+          <w:rFonts w:ascii="Arial Narrow" w:cs="Arial Narrow" w:eastAsia="Arial Narrow" w:hAnsi="Arial Narrow"/>
+          <w:b/>
+          <w:bCs/>
+          <w:sz w:val="11"/>
+          <w:szCs w:val="11"/>
+        </w:rPr>
+        <w:t xml:space="preserve">Kriptologija</w:t>
+      </w:r>
+      <w:r>
+        <w:rPr>
+          <w:rFonts w:ascii="Arial Narrow" w:cs="Arial Narrow" w:eastAsia="Arial Narrow" w:hAnsi="Arial Narrow"/>
+          <w:b w:val="false"/>
+          <w:bCs w:val="false"/>
+          <w:sz w:val="11"/>
+          <w:szCs w:val="11"/>
+        </w:rPr>
+        <w:t xml:space="preserve">=nauka o zaštiti; </w:t>
+      </w:r>
+      <w:r>
+        <w:rPr>
+          <w:rFonts w:ascii="Arial Narrow" w:cs="Arial Narrow" w:eastAsia="Arial Narrow" w:hAnsi="Arial Narrow"/>
+          <w:b/>
+          <w:bCs/>
+          <w:sz w:val="11"/>
+          <w:szCs w:val="11"/>
+        </w:rPr>
+        <w:t xml:space="preserve">kriptografija</w:t>
+      </w:r>
+      <w:r>
+        <w:rPr>
+          <w:rFonts w:ascii="Arial Narrow" w:cs="Arial Narrow" w:eastAsia="Arial Narrow" w:hAnsi="Arial Narrow"/>
+          <w:b w:val="false"/>
+          <w:bCs w:val="false"/>
+          <w:sz w:val="11"/>
+          <w:szCs w:val="11"/>
+        </w:rPr>
+        <w:t xml:space="preserve">=pravljenje zaštite; </w:t>
+      </w:r>
+      <w:r>
+        <w:rPr>
+          <w:rFonts w:ascii="Arial Narrow" w:cs="Arial Narrow" w:eastAsia="Arial Narrow" w:hAnsi="Arial Narrow"/>
+          <w:b/>
+          <w:bCs/>
+          <w:sz w:val="11"/>
+          <w:szCs w:val="11"/>
+        </w:rPr>
+        <w:t xml:space="preserve">kriptoanaliza</w:t>
+      </w:r>
+      <w:r>
+        <w:rPr>
+          <w:rFonts w:ascii="Arial Narrow" w:cs="Arial Narrow" w:eastAsia="Arial Narrow" w:hAnsi="Arial Narrow"/>
+          <w:b w:val="false"/>
+          <w:bCs w:val="false"/>
+          <w:sz w:val="11"/>
+          <w:szCs w:val="11"/>
+        </w:rPr>
+        <w:t xml:space="preserve">=razbijanje zaštite.</w:t>
+      </w:r>
+    </w:p>
+    <w:p>
+      <w:pPr>
+        <w:spacing w:after="10" w:before="0" w:line="120" w:lineRule="exact"/>
+        <w:jc w:val="left"/>
+      </w:pPr>
+      <w:r>
+        <w:rPr>
+          <w:rFonts w:ascii="Arial Narrow" w:cs="Arial Narrow" w:eastAsia="Arial Narrow" w:hAnsi="Arial Narrow"/>
+          <w:b w:val="false"/>
+          <w:bCs w:val="false"/>
+          <w:sz w:val="11"/>
+          <w:szCs w:val="11"/>
+        </w:rPr>
+        <w:t xml:space="preserve"/>
+      </w:r>
+      <w:r>
+        <w:rPr>
+          <w:rFonts w:ascii="Arial Narrow" w:cs="Arial Narrow" w:eastAsia="Arial Narrow" w:hAnsi="Arial Narrow"/>
+          <w:b/>
+          <w:bCs/>
+          <w:sz w:val="11"/>
+          <w:szCs w:val="11"/>
+        </w:rPr>
+        <w:t xml:space="preserve">Kerkhof:</w:t>
+      </w:r>
+      <w:r>
+        <w:rPr>
+          <w:rFonts w:ascii="Arial Narrow" w:cs="Arial Narrow" w:eastAsia="Arial Narrow" w:hAnsi="Arial Narrow"/>
+          <w:b w:val="false"/>
+          <w:bCs w:val="false"/>
+          <w:sz w:val="11"/>
+          <w:szCs w:val="11"/>
+        </w:rPr>
+        <w:t xml:space="preserve"> sistem je siguran i kad je sve osim ključa poznato.</w:t>
+      </w:r>
+    </w:p>
+    <w:p>
+      <w:pPr>
+        <w:spacing w:after="10" w:before="0" w:line="120" w:lineRule="exact"/>
+        <w:jc w:val="left"/>
+      </w:pPr>
+      <w:r>
+        <w:rPr>
+          <w:rFonts w:ascii="Arial Narrow" w:cs="Arial Narrow" w:eastAsia="Arial Narrow" w:hAnsi="Arial Narrow"/>
+          <w:b w:val="false"/>
+          <w:bCs w:val="false"/>
+          <w:sz w:val="11"/>
+          <w:szCs w:val="11"/>
+        </w:rPr>
+        <w:t xml:space="preserve"/>
+      </w:r>
+      <w:r>
+        <w:rPr>
+          <w:rFonts w:ascii="Arial Narrow" w:cs="Arial Narrow" w:eastAsia="Arial Narrow" w:hAnsi="Arial Narrow"/>
+          <w:b/>
+          <w:bCs/>
+          <w:sz w:val="11"/>
+          <w:szCs w:val="11"/>
+        </w:rPr>
+        <w:t xml:space="preserve">Prostor ključeva</w:t>
+      </w:r>
+      <w:r>
+        <w:rPr>
+          <w:rFonts w:ascii="Arial Narrow" w:cs="Arial Narrow" w:eastAsia="Arial Narrow" w:hAnsi="Arial Narrow"/>
+          <w:b w:val="false"/>
+          <w:bCs w:val="false"/>
+          <w:sz w:val="11"/>
+          <w:szCs w:val="11"/>
+        </w:rPr>
+        <w:t xml:space="preserve">=skup svih ključeva; </w:t>
+      </w:r>
+      <w:r>
+        <w:rPr>
+          <w:rFonts w:ascii="Arial Narrow" w:cs="Arial Narrow" w:eastAsia="Arial Narrow" w:hAnsi="Arial Narrow"/>
+          <w:b/>
+          <w:bCs/>
+          <w:sz w:val="11"/>
+          <w:szCs w:val="11"/>
+        </w:rPr>
+        <w:t xml:space="preserve">potpuna pretraga</w:t>
+      </w:r>
+      <w:r>
+        <w:rPr>
+          <w:rFonts w:ascii="Arial Narrow" w:cs="Arial Narrow" w:eastAsia="Arial Narrow" w:hAnsi="Arial Narrow"/>
+          <w:b w:val="false"/>
+          <w:bCs w:val="false"/>
+          <w:sz w:val="11"/>
+          <w:szCs w:val="11"/>
+        </w:rPr>
+        <w:t xml:space="preserve">=probati sve ključeve; </w:t>
+      </w:r>
+      <w:r>
+        <w:rPr>
+          <w:rFonts w:ascii="Arial Narrow" w:cs="Arial Narrow" w:eastAsia="Arial Narrow" w:hAnsi="Arial Narrow"/>
+          <w:b/>
+          <w:bCs/>
+          <w:sz w:val="11"/>
+          <w:szCs w:val="11"/>
+        </w:rPr>
+        <w:t xml:space="preserve">skraćeni napad</w:t>
+      </w:r>
+      <w:r>
+        <w:rPr>
+          <w:rFonts w:ascii="Arial Narrow" w:cs="Arial Narrow" w:eastAsia="Arial Narrow" w:hAnsi="Arial Narrow"/>
+          <w:b w:val="false"/>
+          <w:bCs w:val="false"/>
+          <w:sz w:val="11"/>
+          <w:szCs w:val="11"/>
+        </w:rPr>
+        <w:t xml:space="preserve">=brži od potpune pretrage.</w:t>
+      </w:r>
+    </w:p>
+    <w:p>
+      <w:pPr>
+        <w:spacing w:after="10" w:before="0" w:line="120" w:lineRule="exact"/>
+        <w:jc w:val="left"/>
+      </w:pPr>
+      <w:r>
+        <w:rPr>
+          <w:rFonts w:ascii="Arial Narrow" w:cs="Arial Narrow" w:eastAsia="Arial Narrow" w:hAnsi="Arial Narrow"/>
+          <w:b w:val="false"/>
+          <w:bCs w:val="false"/>
+          <w:sz w:val="11"/>
+          <w:szCs w:val="11"/>
+        </w:rPr>
+        <w:t xml:space="preserve"/>
+      </w:r>
+      <w:r>
+        <w:rPr>
+          <w:rFonts w:ascii="Arial Narrow" w:cs="Arial Narrow" w:eastAsia="Arial Narrow" w:hAnsi="Arial Narrow"/>
+          <w:b/>
+          <w:bCs/>
+          <w:sz w:val="11"/>
+          <w:szCs w:val="11"/>
+        </w:rPr>
+        <w:t xml:space="preserve">Transpozicija</w:t>
+      </w:r>
+      <w:r>
+        <w:rPr>
+          <w:rFonts w:ascii="Arial Narrow" w:cs="Arial Narrow" w:eastAsia="Arial Narrow" w:hAnsi="Arial Narrow"/>
+          <w:b w:val="false"/>
+          <w:bCs w:val="false"/>
+          <w:sz w:val="11"/>
+          <w:szCs w:val="11"/>
+        </w:rPr>
+        <w:t xml:space="preserve">=premešta slova; </w:t>
+      </w:r>
+      <w:r>
+        <w:rPr>
+          <w:rFonts w:ascii="Arial Narrow" w:cs="Arial Narrow" w:eastAsia="Arial Narrow" w:hAnsi="Arial Narrow"/>
+          <w:b/>
+          <w:bCs/>
+          <w:sz w:val="11"/>
+          <w:szCs w:val="11"/>
+        </w:rPr>
+        <w:t xml:space="preserve">supstitucija</w:t>
+      </w:r>
+      <w:r>
+        <w:rPr>
+          <w:rFonts w:ascii="Arial Narrow" w:cs="Arial Narrow" w:eastAsia="Arial Narrow" w:hAnsi="Arial Narrow"/>
+          <w:b w:val="false"/>
+          <w:bCs w:val="false"/>
+          <w:sz w:val="11"/>
+          <w:szCs w:val="11"/>
+        </w:rPr>
+        <w:t xml:space="preserve">=menja slova. </w:t>
+      </w:r>
+      <w:r>
+        <w:rPr>
+          <w:rFonts w:ascii="Arial Narrow" w:cs="Arial Narrow" w:eastAsia="Arial Narrow" w:hAnsi="Arial Narrow"/>
+          <w:b/>
+          <w:bCs/>
+          <w:sz w:val="11"/>
+          <w:szCs w:val="11"/>
+        </w:rPr>
+        <w:t xml:space="preserve">Homofona</w:t>
+      </w:r>
+      <w:r>
+        <w:rPr>
+          <w:rFonts w:ascii="Arial Narrow" w:cs="Arial Narrow" w:eastAsia="Arial Narrow" w:hAnsi="Arial Narrow"/>
+          <w:b w:val="false"/>
+          <w:bCs w:val="false"/>
+          <w:sz w:val="11"/>
+          <w:szCs w:val="11"/>
+        </w:rPr>
+        <w:t xml:space="preserve">=više znakova za česta slova (32−26=6: A,E,N,O,R,T).</w:t>
+      </w:r>
+    </w:p>
+    <w:p>
+      <w:pPr>
+        <w:spacing w:after="10" w:before="0" w:line="120" w:lineRule="exact"/>
+        <w:jc w:val="left"/>
+      </w:pPr>
+      <w:r>
+        <w:rPr>
+          <w:rFonts w:ascii="Arial Narrow" w:cs="Arial Narrow" w:eastAsia="Arial Narrow" w:hAnsi="Arial Narrow"/>
+          <w:b w:val="false"/>
+          <w:bCs w:val="false"/>
+          <w:sz w:val="11"/>
+          <w:szCs w:val="11"/>
+        </w:rPr>
+        <w:t xml:space="preserve"/>
+      </w:r>
+      <w:r>
+        <w:rPr>
+          <w:rFonts w:ascii="Arial Narrow" w:cs="Arial Narrow" w:eastAsia="Arial Narrow" w:hAnsi="Arial Narrow"/>
+          <w:b/>
+          <w:bCs/>
+          <w:sz w:val="11"/>
+          <w:szCs w:val="11"/>
+        </w:rPr>
+        <w:t xml:space="preserve">Simetrični</w:t>
+      </w:r>
+      <w:r>
+        <w:rPr>
+          <w:rFonts w:ascii="Arial Narrow" w:cs="Arial Narrow" w:eastAsia="Arial Narrow" w:hAnsi="Arial Narrow"/>
+          <w:b w:val="false"/>
+          <w:bCs w:val="false"/>
+          <w:sz w:val="11"/>
+          <w:szCs w:val="11"/>
+        </w:rPr>
+        <w:t xml:space="preserve">=1 isti ključ; </w:t>
+      </w:r>
+      <w:r>
+        <w:rPr>
+          <w:rFonts w:ascii="Arial Narrow" w:cs="Arial Narrow" w:eastAsia="Arial Narrow" w:hAnsi="Arial Narrow"/>
+          <w:b/>
+          <w:bCs/>
+          <w:sz w:val="11"/>
+          <w:szCs w:val="11"/>
+        </w:rPr>
+        <w:t xml:space="preserve">asimetrični</w:t>
+      </w:r>
+      <w:r>
+        <w:rPr>
+          <w:rFonts w:ascii="Arial Narrow" w:cs="Arial Narrow" w:eastAsia="Arial Narrow" w:hAnsi="Arial Narrow"/>
+          <w:b w:val="false"/>
+          <w:bCs w:val="false"/>
+          <w:sz w:val="11"/>
+          <w:szCs w:val="11"/>
+        </w:rPr>
+        <w:t xml:space="preserve">=javni šifruje, privatni dešifruje. </w:t>
+      </w:r>
+      <w:r>
+        <w:rPr>
+          <w:rFonts w:ascii="Arial Narrow" w:cs="Arial Narrow" w:eastAsia="Arial Narrow" w:hAnsi="Arial Narrow"/>
+          <w:b/>
+          <w:bCs/>
+          <w:sz w:val="11"/>
+          <w:szCs w:val="11"/>
+        </w:rPr>
+        <w:t xml:space="preserve">Steganografija</w:t>
+      </w:r>
+      <w:r>
+        <w:rPr>
+          <w:rFonts w:ascii="Arial Narrow" w:cs="Arial Narrow" w:eastAsia="Arial Narrow" w:hAnsi="Arial Narrow"/>
+          <w:b w:val="false"/>
+          <w:bCs w:val="false"/>
+          <w:sz w:val="11"/>
+          <w:szCs w:val="11"/>
+        </w:rPr>
+        <w:t xml:space="preserve">=skriva postojanje poruke.</w:t>
+      </w:r>
+    </w:p>
+    <w:p>
+      <w:pPr>
+        <w:spacing w:after="10" w:before="0" w:line="120" w:lineRule="exact"/>
+        <w:jc w:val="left"/>
+      </w:pPr>
+      <w:r>
+        <w:rPr>
+          <w:rFonts w:ascii="Arial Narrow" w:cs="Arial Narrow" w:eastAsia="Arial Narrow" w:hAnsi="Arial Narrow"/>
+          <w:b w:val="false"/>
+          <w:bCs w:val="false"/>
+          <w:sz w:val="11"/>
+          <w:szCs w:val="11"/>
+        </w:rPr>
+        <w:t xml:space="preserve"/>
+      </w:r>
+      <w:r>
+        <w:rPr>
+          <w:rFonts w:ascii="Arial Narrow" w:cs="Arial Narrow" w:eastAsia="Arial Narrow" w:hAnsi="Arial Narrow"/>
+          <w:b/>
+          <w:bCs/>
+          <w:sz w:val="11"/>
+          <w:szCs w:val="11"/>
+        </w:rPr>
+        <w:t xml:space="preserve">CIA</w:t>
+      </w:r>
+      <w:r>
+        <w:rPr>
+          <w:rFonts w:ascii="Arial Narrow" w:cs="Arial Narrow" w:eastAsia="Arial Narrow" w:hAnsi="Arial Narrow"/>
+          <w:b w:val="false"/>
+          <w:bCs w:val="false"/>
+          <w:sz w:val="11"/>
+          <w:szCs w:val="11"/>
+        </w:rPr>
+        <w:t xml:space="preserve">=poverljivost, integritet, raspoloživost. </w:t>
+      </w:r>
+      <w:r>
+        <w:rPr>
+          <w:rFonts w:ascii="Arial Narrow" w:cs="Arial Narrow" w:eastAsia="Arial Narrow" w:hAnsi="Arial Narrow"/>
+          <w:b/>
+          <w:bCs/>
+          <w:sz w:val="11"/>
+          <w:szCs w:val="11"/>
+        </w:rPr>
+        <w:t xml:space="preserve">Protočne</w:t>
+      </w:r>
+      <w:r>
+        <w:rPr>
+          <w:rFonts w:ascii="Arial Narrow" w:cs="Arial Narrow" w:eastAsia="Arial Narrow" w:hAnsi="Arial Narrow"/>
+          <w:b w:val="false"/>
+          <w:bCs w:val="false"/>
+          <w:sz w:val="11"/>
+          <w:szCs w:val="11"/>
+        </w:rPr>
+        <w:t xml:space="preserve">=bit po bit; </w:t>
+      </w:r>
+      <w:r>
+        <w:rPr>
+          <w:rFonts w:ascii="Arial Narrow" w:cs="Arial Narrow" w:eastAsia="Arial Narrow" w:hAnsi="Arial Narrow"/>
+          <w:b/>
+          <w:bCs/>
+          <w:sz w:val="11"/>
+          <w:szCs w:val="11"/>
+        </w:rPr>
+        <w:t xml:space="preserve">blokovske</w:t>
+      </w:r>
+      <w:r>
+        <w:rPr>
+          <w:rFonts w:ascii="Arial Narrow" w:cs="Arial Narrow" w:eastAsia="Arial Narrow" w:hAnsi="Arial Narrow"/>
+          <w:b w:val="false"/>
+          <w:bCs w:val="false"/>
+          <w:sz w:val="11"/>
+          <w:szCs w:val="11"/>
+        </w:rPr>
+        <w:t xml:space="preserve">=blokovi 64 (128) bita.</w:t>
       </w:r>
     </w:p>
     <w:p>
       <w:pPr>
         <w:sectPr>
           <w:pgSz w:w="11906" w:h="16838" w:orient="portrait"/>
-          <w:pgMar w:top="113" w:right="6974" w:bottom="113" w:left="113" w:header="708" w:footer="708" w:gutter="0"/>
+          <w:pgMar w:top="113" w:right="6691" w:bottom="113" w:left="113" w:header="708" w:footer="708" w:gutter="0"/>
           <w:pgNumType/>
           <w:cols w:space="60" w:num="2" w:equalWidth="true"/>
           <w:docGrid w:linePitch="360"/>
@@ -754,7 +1270,7 @@
     <w:sectPr>
       <w:type w:val="continuous"/>
       <w:pgSz w:w="11906" w:h="16838" w:orient="portrait"/>
-      <w:pgMar w:top="113" w:right="6974" w:bottom="113" w:left="113" w:header="708" w:footer="708" w:gutter="0"/>
+      <w:pgMar w:top="113" w:right="6691" w:bottom="113" w:left="113" w:header="708" w:footer="708" w:gutter="0"/>
       <w:pgNumType/>
       <w:docGrid w:linePitch="360"/>
     </w:sectPr>

</xml_diff>